<commit_message>
feat: FMS.2 SOP as plain-language body + audit appendix (one file)
Staff-facing body has zero NABH standard codes and zero "NABH requires"
framing -- every requirement is justified by patient/family/staff safety
instead. OE codes, boundary/disambiguation against neighbouring standards,
and verified citations move to an Appendix after the body, for the Quality
Coordinator and assessors only. Single controlled document, not two
separate SOPs, to avoid document-control drift.

Adds SOPSpecV2/build_sop_v2 to sop_record_common.py as a new, additive
builder -- every other chapter (AAC/COP/ROM/HRM, FMS.1/.3/.4/.5) still
builds from the original build_sop()/SOPSpec unchanged. Records for FMS.2
are untouched.

Sample-approved by Mk after 4 iterations (plain body -> 3-box intro ->
patient-safety reframe -> boxes trimmed to one per-section "Why:" line).

Co-Authored-By: Claude Sonnet 5 <noreply@anthropic.com>
Claude-Session: https://claude.ai/code/session_016VFLsECWt4VArpBiaqgrgF
</commit_message>
<xml_diff>
--- a/policies/build/sop_record_masters/FMS/SOP_FMS.2.a_to_g_patient_family_staff_visitor_safety.docx
+++ b/policies/build/sop_record_masters/FMS/SOP_FMS.2.a_to_g_patient_family_staff_visitor_safety.docx
@@ -14,80 +14,9 @@
     </w:p>
     <w:p>
       <w:r>
-        <w:t>«Hospital Name» — Supports FMS.2.a-g</w:t>
+        <w:t>«Hospital Name» — SOP-FMS.2 — Version 1.0</w:t>
       </w:r>
     </w:p>
-    <w:p/>
-    <w:p/>
-    <w:p/>
-    <w:tbl>
-      <w:tblPr>
-        <w:tblStyle w:val="TableGrid"/>
-        <w:tblW w:type="auto" w:w="0"/>
-        <w:tblLook w:firstColumn="1" w:firstRow="1" w:lastColumn="0" w:lastRow="0" w:noHBand="0" w:noVBand="1" w:val="04A0"/>
-      </w:tblPr>
-      <w:tblGrid>
-        <w:gridCol w:w="8640"/>
-      </w:tblGrid>
-      <w:tr>
-        <w:tc>
-          <w:tcPr>
-            <w:tcW w:type="dxa" w:w="8640"/>
-          </w:tcPr>
-          <w:p>
-            <w:r>
-              <w:t>This SOP tells facilities, security, engineering and quality staff, in one place, how this hospital keeps the building itself safe: the grab rails and call bells that actually work, access for the differently-abled, which areas need extra security, the monthly walk that finds what a register alone cannot, the electrical audit that is not just a DG test, how condemned items actually leave the clinical floor, and how hazardous materials are tracked and used safely. If you walk a round, hold a key, sign off an audit, or tag a condemned bed, this SOP is for you.</w:t>
-            </w:r>
-          </w:p>
-        </w:tc>
-      </w:tr>
-    </w:tbl>
-    <w:p/>
-    <w:tbl>
-      <w:tblPr>
-        <w:tblStyle w:val="TableGrid"/>
-        <w:tblW w:type="auto" w:w="0"/>
-        <w:tblLook w:firstColumn="1" w:firstRow="1" w:lastColumn="0" w:lastRow="0" w:noHBand="0" w:noVBand="1" w:val="04A0"/>
-      </w:tblPr>
-      <w:tblGrid>
-        <w:gridCol w:w="8640"/>
-      </w:tblGrid>
-      <w:tr>
-        <w:tc>
-          <w:tcPr>
-            <w:tcW w:type="dxa" w:w="8640"/>
-          </w:tcPr>
-          <w:p>
-            <w:r>
-              <w:t>A monthly facility round finds a grab rail pulled out of a wet-wall fixing in a ground-floor toilet. This SOP is what tells the rounding staff member which record to log it in, who closes the finding, and by when -- rather than the defect sitting unaddressed until the next round finds it again.</w:t>
-            </w:r>
-          </w:p>
-        </w:tc>
-      </w:tr>
-    </w:tbl>
-    <w:p/>
-    <w:tbl>
-      <w:tblPr>
-        <w:tblStyle w:val="TableGrid"/>
-        <w:tblW w:type="auto" w:w="0"/>
-        <w:tblLook w:firstColumn="1" w:firstRow="1" w:lastColumn="0" w:lastRow="0" w:noHBand="0" w:noVBand="1" w:val="04A0"/>
-      </w:tblPr>
-      <w:tblGrid>
-        <w:gridCol w:w="8640"/>
-      </w:tblGrid>
-      <w:tr>
-        <w:tc>
-          <w:tcPr>
-            <w:tcW w:type="dxa" w:w="8640"/>
-          </w:tcPr>
-          <w:p>
-            <w:r>
-              <w:t>NABH requires patient-safety devices and infrastructure, facilities for the differently-abled, a description of extra-security areas and access, a monthly facility safety round (a Core, non-negotiable interval), electrical safety audits, a procedure for identifying and disposing of material not in use, and identification and safe use of hazardous materials -- the last two being the chapter's asterisked, documented-evidence elements.</w:t>
-            </w:r>
-          </w:p>
-        </w:tc>
-      </w:tr>
-    </w:tbl>
     <w:p/>
     <w:tbl>
       <w:tblPr>
@@ -195,6 +124,75 @@
         <w:t>1. Purpose</w:t>
       </w:r>
     </w:p>
+    <w:tbl>
+      <w:tblPr>
+        <w:tblStyle w:val="TableGrid"/>
+        <w:tblW w:type="auto" w:w="0"/>
+        <w:tblLook w:firstColumn="1" w:firstRow="1" w:lastColumn="0" w:lastRow="0" w:noHBand="0" w:noVBand="1" w:val="04A0"/>
+      </w:tblPr>
+      <w:tblGrid>
+        <w:gridCol w:w="8640"/>
+      </w:tblGrid>
+      <w:tr>
+        <w:tc>
+          <w:tcPr>
+            <w:tcW w:type="dxa" w:w="8640"/>
+          </w:tcPr>
+          <w:p>
+            <w:r>
+              <w:t>This SOP tells facilities, security, engineering and quality staff, in one place, how this hospital keeps the building itself safe: the grab rails and call bells that actually work, access for the differently-abled, which areas need extra security, the monthly walk that finds what a register alone cannot, the electrical audit that is not just a DG test, how condemned items actually leave the clinical floor, and how hazardous materials are tracked and used safely. If you walk a round, hold a key, sign off an audit, or tag a condemned bed, this SOP is for you.</w:t>
+            </w:r>
+          </w:p>
+        </w:tc>
+      </w:tr>
+    </w:tbl>
+    <w:p/>
+    <w:tbl>
+      <w:tblPr>
+        <w:tblStyle w:val="TableGrid"/>
+        <w:tblW w:type="auto" w:w="0"/>
+        <w:tblLook w:firstColumn="1" w:firstRow="1" w:lastColumn="0" w:lastRow="0" w:noHBand="0" w:noVBand="1" w:val="04A0"/>
+      </w:tblPr>
+      <w:tblGrid>
+        <w:gridCol w:w="8640"/>
+      </w:tblGrid>
+      <w:tr>
+        <w:tc>
+          <w:tcPr>
+            <w:tcW w:type="dxa" w:w="8640"/>
+          </w:tcPr>
+          <w:p>
+            <w:r>
+              <w:t>A monthly facility round finds a grab rail pulled out of a wet-wall fixing in a ground-floor toilet. This SOP is what tells the rounding staff member which record to log it in, who closes the finding, and by when -- rather than the defect sitting unaddressed until the next round finds it again.</w:t>
+            </w:r>
+          </w:p>
+        </w:tc>
+      </w:tr>
+    </w:tbl>
+    <w:p/>
+    <w:tbl>
+      <w:tblPr>
+        <w:tblStyle w:val="TableGrid"/>
+        <w:tblW w:type="auto" w:w="0"/>
+        <w:tblLook w:firstColumn="1" w:firstRow="1" w:lastColumn="0" w:lastRow="0" w:noHBand="0" w:noVBand="1" w:val="04A0"/>
+      </w:tblPr>
+      <w:tblGrid>
+        <w:gridCol w:w="8640"/>
+      </w:tblGrid>
+      <w:tr>
+        <w:tc>
+          <w:tcPr>
+            <w:tcW w:type="dxa" w:w="8640"/>
+          </w:tcPr>
+          <w:p>
+            <w:r>
+              <w:t>We do this because a hospital's job is to keep the people inside it safe, not just treat the illness they came in for. The devices, the monthly round, the electrical audits, how we remove broken items, and how we handle hazardous materials are the ways the building itself stays on the patient's side, not a risk to them.</w:t>
+            </w:r>
+          </w:p>
+        </w:tc>
+      </w:tr>
+    </w:tbl>
+    <w:p/>
     <w:p>
       <w:r>
         <w:t>To define how «Hospital Name» keeps patients, families, staff and visitors safe from the building itself: installed safety devices, access for the differently-abled, extra-security areas, the monthly facility round, electrical safety audits, disposal of material not in use, and the safe identification and use of hazardous materials.</w:t>
@@ -210,7 +208,18 @@
     </w:p>
     <w:p>
       <w:r>
-        <w:t>Applies to every area of {{HOSPITAL_NAME}} that patients, families, staff or visitors use. It does not cover fire detection, alarms, extinguishers or suppression (FMS.5), medical-device calibration (FMS.3), biomedical-waste colour coding and transport (HIC.3), blood/body-fluid spill response (HIC.2), cytotoxic spill response (MOM.8), or laboratory bench chemical hygiene (AAC.6) -- those remain their own documents and are only pointed to here where this SOP's steps hand work to them.</w:t>
+        <w:rPr>
+          <w:i/>
+        </w:rPr>
+        <w:t xml:space="preserve">Why: </w:t>
+      </w:r>
+      <w:r>
+        <w:t>so whoever spots a problem -- staff, contractor or visitor -- knows exactly where to take it, and nothing falls through the gap between two SOPs while someone is waiting for it to be fixed.</w:t>
+      </w:r>
+    </w:p>
+    <w:p>
+      <w:r>
+        <w:t>Applies to every area of «Hospital Name» that patients, families, staff or visitors use. Does not cover fire detection, alarms, extinguishers or suppression, medical-device calibration, biomedical-waste colour coding and transport, blood/body-fluid spill response, cytotoxic spill response, or laboratory bench chemical hygiene -- those remain their own SOPs. See Related SOPs.</w:t>
       </w:r>
     </w:p>
     <w:p>
@@ -223,27 +232,68 @@
     </w:p>
     <w:p>
       <w:r>
-        <w:t>Head of the Institution: Is accountable that the facility operates so that patients, families, staff and visitors are safe as this SOP requires.</w:t>
+        <w:rPr>
+          <w:i/>
+        </w:rPr>
+        <w:t xml:space="preserve">Why: </w:t>
+      </w:r>
+      <w:r>
+        <w:t>a hazard with one person's name on it gets fixed. A hazard that's "everyone's job" sits there until someone gets hurt.</w:t>
       </w:r>
     </w:p>
     <w:p>
       <w:r>
-        <w:t>Named Facilities/Engineering Lead: Holds device inspections, monthly rounds, electrical audits, unused-material records and the hazardous-material inventory.</w:t>
+        <w:rPr>
+          <w:b/>
+        </w:rPr>
+        <w:t xml:space="preserve">Head of the Institution: </w:t>
+      </w:r>
+      <w:r>
+        <w:t>Is accountable that the facility actually operates safely, not just on paper.</w:t>
       </w:r>
     </w:p>
     <w:p>
       <w:r>
-        <w:t>Security/Administration: Holds the extra-security and access description, where this is not the facilities lead.</w:t>
+        <w:rPr>
+          <w:b/>
+        </w:rPr>
+        <w:t xml:space="preserve">Named Facilities/Engineering Lead: </w:t>
+      </w:r>
+      <w:r>
+        <w:t>Carries out device inspections, the monthly round, electrical audits, the unused-material log and the hazardous-material inventory.</w:t>
       </w:r>
     </w:p>
     <w:p>
       <w:r>
-        <w:t>Quality/Accreditation Coordinator: Audits a sample of the records this SOP produces, at «Hospital to define» frequency, flagging a mismatch rather than filing it.</w:t>
+        <w:rPr>
+          <w:b/>
+        </w:rPr>
+        <w:t xml:space="preserve">Security/Administration: </w:t>
+      </w:r>
+      <w:r>
+        <w:t>Looks after the extra-security and access description, where this is not the facilities lead.</w:t>
       </w:r>
     </w:p>
     <w:p>
       <w:r>
-        <w:t>All Staff: Treat a blocked exit, an unlabelled chemical, a condemned bed left in a patient bay, or a monthly register with no actual walk, as defects to report, not someone else's problem.</w:t>
+        <w:rPr>
+          <w:b/>
+        </w:rPr>
+        <w:t xml:space="preserve">Quality/Accreditation Coordinator: </w:t>
+      </w:r>
+      <w:r>
+        <w:t>Spot-checks a sample of the records this SOP produces, at «Hospital to define» frequency, and owns the Appendix during assessment.</w:t>
+      </w:r>
+    </w:p>
+    <w:p>
+      <w:r>
+        <w:rPr>
+          <w:b/>
+        </w:rPr>
+        <w:t xml:space="preserve">All Staff: </w:t>
+      </w:r>
+      <w:r>
+        <w:t>Report a blocked exit, an unlabelled chemical, a condemned bed left in a patient bay, or a missed monthly round, as defects -- not someone else's problem.</w:t>
       </w:r>
     </w:p>
     <w:p>
@@ -251,7 +301,7 @@
         <w:pStyle w:val="Heading1"/>
       </w:pPr>
       <w:r>
-        <w:t>4. Procedure</w:t>
+        <w:t>4. What to do</w:t>
       </w:r>
     </w:p>
     <w:p>
@@ -259,37 +309,382 @@
         <w:pStyle w:val="Heading2"/>
       </w:pPr>
       <w:r>
-        <w:t>4.1 Patient-safety devices and infrastructure, installed and inspected (FMS.2.a)</w:t>
+        <w:t>Keeping patient-safety devices working</w:t>
       </w:r>
     </w:p>
     <w:p>
       <w:r>
-        <w:t>Why this step matters: A grab rail that pulled out of a wet-wall fixing, or a call bell that rings at the panel but not in the room, is the failure this step exists to catch -- not the absence of the device, but a device that looks installed and does not actually work.</w:t>
+        <w:rPr>
+          <w:i/>
+        </w:rPr>
+        <w:t xml:space="preserve">Why: </w:t>
+      </w:r>
+      <w:r>
+        <w:t>A patient or family member trusts that a grab rail or call bell will work the moment they actually need it -- not that one was purchased once. We check the devices, not the paperwork, because that's the only check that protects anyone.</w:t>
       </w:r>
     </w:p>
     <w:p>
       <w:r>
-        <w:t>1. Patient-safety devices and infrastructure installed across the organisation include grab rails in toilets and wet areas, anti-skid flooring where water is expected, window restrictors on upper floors, bumper guards on trolley routes, nurse-call/emergency-bell hardware, and bed-rail hardware -- the devices this hospital actually runs.</w:t>
+        <w:t>Grab rails in toilets and wet areas, anti-skid flooring, window restrictors on upper floors, bumper guards on trolley routes, nurse-call buttons and bed rails -- all of it gets checked that it actually works, not just that it's installed.</w:t>
       </w:r>
     </w:p>
     <w:p>
       <w:r>
-        <w:t>2. Fire detection, alarms, extinguishers and suppression are FMS.5 provisions, inspected under FMS.5.d; they are listed on the monthly round (4.4 below) as found/blocked/failed, not counted twice as this OE's own install-and-inspect programme.</w:t>
+        <w:t>«Hospital to define: which devices are checked, how often, and by whom.» A real check means testing the device, not reading the purchase record.</w:t>
       </w:r>
     </w:p>
     <w:p>
       <w:r>
-        <w:t>3. «Hospital to define which patient-safety devices and infrastructure are installed, and the inspection interval and method» -- an inspection that tests the device, not one read off a purchase invoice.</w:t>
+        <w:t>Fire equipment is covered separately in the monthly walk-through below. Whether to actually use a bed rail or call bell for a specific patient is a clinical decision made by the care team, not part of this check.</w:t>
+      </w:r>
+    </w:p>
+    <w:p>
+      <w:pPr>
+        <w:pStyle w:val="Heading2"/>
+      </w:pPr>
+      <w:r>
+        <w:t>Access for people with disabilities</w:t>
       </w:r>
     </w:p>
     <w:p>
       <w:r>
-        <w:t>4. COP.12 owns the clinical decision to use a bed rail or a call bell at the bedside; this step owns that the hardware exists and works.</w:t>
+        <w:rPr>
+          <w:i/>
+        </w:rPr>
+        <w:t xml:space="preserve">Why: </w:t>
+      </w:r>
+      <w:r>
+        <w:t>Every patient and family member deserves to reach the care they need, whatever their mobility. Keeping ramps and accessible toilets clear isn't a courtesy -- it's the difference between a hospital that works for everyone and one that only looks like it does.</w:t>
       </w:r>
     </w:p>
     <w:p>
       <w:r>
-        <w:t xml:space="preserve">Technical source(s) for these steps: </w:t>
+        <w:t>Wheelchair users and people with mobility difficulties need to actually reach the floors and services they need.</w:t>
+      </w:r>
+    </w:p>
+    <w:p>
+      <w:r>
+        <w:t>«Hospital to define: what access facilities exist (ramps, a working lift, accessible toilets) and how they're kept usable.»</w:t>
+      </w:r>
+    </w:p>
+    <w:p>
+      <w:r>
+        <w:t>A ramp or accessible toilet that exists on paper but is blocked by a trolley or used for storage is a failure, not a technicality.</w:t>
+      </w:r>
+    </w:p>
+    <w:p>
+      <w:pPr>
+        <w:pStyle w:val="Heading2"/>
+      </w:pPr>
+      <w:r>
+        <w:t>Extra-security areas</w:t>
+      </w:r>
+    </w:p>
+    <w:p>
+      <w:r>
+        <w:rPr>
+          <w:i/>
+        </w:rPr>
+        <w:t xml:space="preserve">Why: </w:t>
+      </w:r>
+      <w:r>
+        <w:t>A locked door is sometimes the only thing between a newborn and someone who shouldn't be near her, or between a controlled drug and someone who shouldn't have it. We control these areas because the harm from getting it wrong can be serious and immediate.</w:t>
+      </w:r>
+    </w:p>
+    <w:p>
+      <w:r>
+        <w:t>Some areas need to be harder to get into than a normal corridor: the pharmacy store, medical records (if kept on-site), the newborn nursery and labour area, server/plant rooms, and the medical gas store.</w:t>
+      </w:r>
+    </w:p>
+    <w:p>
+      <w:r>
+        <w:t>«Hospital to define: which areas count, who can access them, and how (locks, access control, CCTV).» A camera nobody watches is not security.</w:t>
+      </w:r>
+    </w:p>
+    <w:p>
+      <w:r>
+        <w:t>Looking after a newborn or a vulnerable patient at the bedside is a separate clinical responsibility -- this is only about the physical security of the area. If a security breach is also a safety incident, report it through the incident system too.</w:t>
+      </w:r>
+    </w:p>
+    <w:p>
+      <w:pPr>
+        <w:pStyle w:val="Heading2"/>
+      </w:pPr>
+      <w:r>
+        <w:t>Monthly safety walk-through</w:t>
+      </w:r>
+    </w:p>
+    <w:p>
+      <w:r>
+        <w:rPr>
+          <w:i/>
+        </w:rPr>
+        <w:t xml:space="preserve">Why: </w:t>
+      </w:r>
+      <w:r>
+        <w:t>A hazard that sits unnoticed for weeks is a hazard waiting for someone to get hurt by it. The monthly round exists to find it before a patient, staff member or visitor does -- every month, without exception, because risk doesn't wait for a convenient quarter.</w:t>
+      </w:r>
+    </w:p>
+    <w:p>
+      <w:r>
+        <w:t>Walk every ward and support area at least once a month -- this interval is fixed, not something the hospital can change.</w:t>
+      </w:r>
+    </w:p>
+    <w:p>
+      <w:r>
+        <w:t>Look for: blocked exits, broken grab rails, wet floors with no warning sign, unlabelled chemicals, old items left lying around, open electrical panels. (A missing fire extinguisher is reported through the Fire Safety SOP instead.)</w:t>
+      </w:r>
+    </w:p>
+    <w:p>
+      <w:r>
+        <w:t>«Hospital to define: who does the walk-through, which route they take, and how findings get fixed.» If a month is missed, that's a defect to report -- not something to quietly catch up on later.</w:t>
+      </w:r>
+    </w:p>
+    <w:p>
+      <w:pPr>
+        <w:pStyle w:val="Heading2"/>
+      </w:pPr>
+      <w:r>
+        <w:t>Electrical safety audit</w:t>
+      </w:r>
+    </w:p>
+    <w:p>
+      <w:r>
+        <w:rPr>
+          <w:i/>
+        </w:rPr>
+        <w:t xml:space="preserve">Why: </w:t>
+      </w:r>
+      <w:r>
+        <w:t>Faulty wiring next to people who can't evacuate quickly on their own isn't an inconvenience -- it's a fire risk. The audit repeats because a building's wiring doesn't stay safe forever just because it was safe on the day it was built.</w:t>
+      </w:r>
+    </w:p>
+    <w:p>
+      <w:r>
+        <w:t>Check: earthing, earth-leakage protection in wet areas and patient-care areas, overloaded circuits, damaged cords, sockets in wet areas, panel labelling and locks, and backup power in the operating theatre if the hospital runs one.</w:t>
+      </w:r>
+    </w:p>
+    <w:p>
+      <w:r>
+        <w:t>«Hospital to define: who audits (in-house or contractor), how often, and the rule for isolating a failed circuit until it's fixed.» A faulty medical device is a different process -- this is only about the building wiring.</w:t>
+      </w:r>
+    </w:p>
+    <w:p>
+      <w:pPr>
+        <w:pStyle w:val="Heading2"/>
+      </w:pPr>
+      <w:r>
+        <w:t>Tagging and removing items no longer in use</w:t>
+      </w:r>
+    </w:p>
+    <w:p>
+      <w:r>
+        <w:rPr>
+          <w:i/>
+        </w:rPr>
+        <w:t xml:space="preserve">Why: </w:t>
+      </w:r>
+      <w:r>
+        <w:t>An untagged, broken item left in a corner is an injury waiting to happen -- to a patient who leans on it, or a staff member who trusts it's still in service. Tagging it the same day it's taken out of use removes that risk immediately, not eventually.</w:t>
+      </w:r>
+    </w:p>
+    <w:p>
+      <w:r>
+        <w:t>Any item no longer in use -- a broken bed, an old monitor, leftover construction material, expired non-medical stock -- gets a tag the same day it's taken out of use. The tag shows what it is, where it is, the date, and who condemned it.</w:t>
+      </w:r>
+    </w:p>
+    <w:p>
+      <w:r>
+        <w:t>Do not reuse a tagged item on a patient. Store it somewhere it can't be picked up by mistake, until it's collected or sold.</w:t>
+      </w:r>
+    </w:p>
+    <w:p>
+      <w:r>
+        <w:t>This is for equipment and furniture -- not clinical waste like used dressings or needles, which has its own separate process.</w:t>
+      </w:r>
+    </w:p>
+    <w:p>
+      <w:r>
+        <w:t>«Hospital to define: who is allowed to condemn an item, and how often tagged items are checked and cleared.»</w:t>
+      </w:r>
+    </w:p>
+    <w:p>
+      <w:pPr>
+        <w:pStyle w:val="Heading2"/>
+      </w:pPr>
+      <w:r>
+        <w:t>Hazardous chemicals -- list, label, protect</w:t>
+      </w:r>
+    </w:p>
+    <w:p>
+      <w:r>
+        <w:rPr>
+          <w:i/>
+        </w:rPr>
+        <w:t xml:space="preserve">Why: </w:t>
+      </w:r>
+      <w:r>
+        <w:t>An unlabelled chemical is a guess waiting to go wrong -- the wrong product on the wrong surface, or on someone's bare skin. The list and the labels exist so nobody handling them ever has to guess.</w:t>
+      </w:r>
+    </w:p>
+    <w:p>
+      <w:r>
+        <w:t>Keep one list of every hazardous chemical in the building -- cleaning chemicals, water-treatment chemicals, diesel and other fuel, mercury (if any old thermometers or BP machines are still in use), engineering solvents.</w:t>
+      </w:r>
+    </w:p>
+    <w:p>
+      <w:r>
+        <w:t>Every container must be labelled. Store and separate chemicals by type. Staff who handle them get the right protective gear.</w:t>
+      </w:r>
+    </w:p>
+    <w:p>
+      <w:r>
+        <w:t>«Hospital to define: who checks this list, how often, and what to do if a spill happens.»</w:t>
+      </w:r>
+    </w:p>
+    <w:p>
+      <w:r>
+        <w:t>If a chemical spills, don't treat it like a blood spill or a lab chemical spill -- those have their own separate SOPs.</w:t>
+      </w:r>
+    </w:p>
+    <w:p>
+      <w:pPr>
+        <w:pStyle w:val="Heading1"/>
+      </w:pPr>
+      <w:r>
+        <w:t>5. Records</w:t>
+      </w:r>
+    </w:p>
+    <w:p>
+      <w:r>
+        <w:t>This SOP produces and maintains Records 1-7 (see the FMS.2 Records folder).</w:t>
+      </w:r>
+    </w:p>
+    <w:p>
+      <w:pPr>
+        <w:pStyle w:val="Heading1"/>
+      </w:pPr>
+      <w:r>
+        <w:t>6. Related SOPs</w:t>
+      </w:r>
+    </w:p>
+    <w:p>
+      <w:pPr>
+        <w:pStyle w:val="ListParagraph"/>
+      </w:pPr>
+      <w:r>
+        <w:t>Fire Safety SOP (FMS.5)</w:t>
+      </w:r>
+    </w:p>
+    <w:p>
+      <w:pPr>
+        <w:pStyle w:val="ListParagraph"/>
+      </w:pPr>
+      <w:r>
+        <w:t>Medical Equipment Maintenance SOP (FMS.3)</w:t>
+      </w:r>
+    </w:p>
+    <w:p>
+      <w:pPr>
+        <w:pStyle w:val="ListParagraph"/>
+      </w:pPr>
+      <w:r>
+        <w:t>Biomedical Waste SOP (HIC.3)</w:t>
+      </w:r>
+    </w:p>
+    <w:p>
+      <w:pPr>
+        <w:pStyle w:val="ListParagraph"/>
+      </w:pPr>
+      <w:r>
+        <w:t>Blood/Body-Fluid Spill SOP (HIC.2)</w:t>
+      </w:r>
+    </w:p>
+    <w:p>
+      <w:pPr>
+        <w:pStyle w:val="ListParagraph"/>
+      </w:pPr>
+      <w:r>
+        <w:t>Chemotherapy Spill SOP (MOM.8)</w:t>
+      </w:r>
+    </w:p>
+    <w:p>
+      <w:pPr>
+        <w:pStyle w:val="ListParagraph"/>
+      </w:pPr>
+      <w:r>
+        <w:t>Laboratory Safety SOP (AAC.6)</w:t>
+      </w:r>
+    </w:p>
+    <w:p>
+      <w:pPr>
+        <w:pStyle w:val="Heading1"/>
+      </w:pPr>
+      <w:r>
+        <w:t>7. Review</w:t>
+      </w:r>
+    </w:p>
+    <w:p>
+      <w:r>
+        <w:t>This SOP is reviewed at «Hospital to define the review interval», and sooner when a monthly round was missed, or when a related SOP listed above is updated.</w:t>
+      </w:r>
+    </w:p>
+    <w:p>
+      <w:r>
+        <w:br w:type="page"/>
+      </w:r>
+    </w:p>
+    <w:p>
+      <w:pPr>
+        <w:pStyle w:val="Heading1"/>
+      </w:pPr>
+      <w:r>
+        <w:t>Appendix — NABH Standard Cross-Reference and Evidence Basis</w:t>
+      </w:r>
+    </w:p>
+    <w:p>
+      <w:r>
+        <w:t>For the Quality Coordinator and NABH assessment use only. The reasoning and real-world triggers for each requirement are already in the body above -- this appendix adds only what the body deliberately leaves out: the exact objective-element code, how this SOP's scope is kept separate from neighbouring standards, and the verified technical source for anything cited.</w:t>
+      </w:r>
+    </w:p>
+    <w:p>
+      <w:pPr>
+        <w:pStyle w:val="Heading2"/>
+      </w:pPr>
+      <w:r>
+        <w:t>Keeping patient-safety devices working — FMS.2.a</w:t>
+      </w:r>
+    </w:p>
+    <w:p>
+      <w:r>
+        <w:rPr>
+          <w:i/>
+        </w:rPr>
+        <w:t>Boundary with other standards:</w:t>
+      </w:r>
+    </w:p>
+    <w:p>
+      <w:pPr>
+        <w:pStyle w:val="ListParagraph"/>
+      </w:pPr>
+      <w:r>
+        <w:t>• Fire detection, alarms, extinguishers and suppression are FMS.5 provisions, inspected under FMS.5.d; listed on the monthly round, not counted twice as this OE's own install-and-inspect programme.</w:t>
+      </w:r>
+    </w:p>
+    <w:p>
+      <w:pPr>
+        <w:pStyle w:val="ListParagraph"/>
+      </w:pPr>
+      <w:r>
+        <w:t>• COP.12 owns the clinical decision to use a bed rail or call bell at the bedside; this step owns that the hardware exists and works.</w:t>
+      </w:r>
+    </w:p>
+    <w:p>
+      <w:r>
+        <w:rPr>
+          <w:i/>
+        </w:rPr>
+        <w:t>Verified source(s):</w:t>
       </w:r>
     </w:p>
     <w:p>
@@ -366,32 +761,31 @@
         <w:pStyle w:val="Heading2"/>
       </w:pPr>
       <w:r>
-        <w:t>4.2 Facilities for the differently-abled (FMS.2.b)</w:t>
+        <w:t>Access for people with disabilities — FMS.2.b</w:t>
       </w:r>
     </w:p>
     <w:p>
       <w:r>
-        <w:t>Why this step matters: A single ramp to a locked side door is not this OE -- a wheelchair user needs to actually reach the floors and services this hospital treats, not just the building's front step.</w:t>
+        <w:rPr>
+          <w:i/>
+        </w:rPr>
+        <w:t>Boundary with other standards:</w:t>
+      </w:r>
+    </w:p>
+    <w:p>
+      <w:pPr>
+        <w:pStyle w:val="ListParagraph"/>
+      </w:pPr>
+      <w:r>
+        <w:t>• NBC 2016 access provisions apply insofar as the local authority applied them to this building's occupancy; this step does not invent a universal door-width or gradient figure for every SHCO.</w:t>
       </w:r>
     </w:p>
     <w:p>
       <w:r>
-        <w:t>1. «Hospital to define facilities for the differently-abled and how they are kept usable» -- ramps or a working lift to the floors this hospital uses for patients, an accessible toilet, and wayfinding a wheelchair user can follow (consistent with FMS.1.c).</w:t>
-      </w:r>
-    </w:p>
-    <w:p>
-      <w:r>
-        <w:t>2. Facilities are kept usable, not blocked by a trolley bay or storage -- a facility that exists on paper but is obstructed in practice fails this step.</w:t>
-      </w:r>
-    </w:p>
-    <w:p>
-      <w:r>
-        <w:t>3. NBC 2016 access provisions apply insofar as the local authority applied them to this building's occupancy; this step does not invent a universal door-width or gradient figure for every SHCO.</w:t>
-      </w:r>
-    </w:p>
-    <w:p>
-      <w:r>
-        <w:t xml:space="preserve">Technical source(s) for these steps: </w:t>
+        <w:rPr>
+          <w:i/>
+        </w:rPr>
+        <w:t>Verified source(s):</w:t>
       </w:r>
     </w:p>
     <w:p>
@@ -445,32 +839,31 @@
         <w:pStyle w:val="Heading2"/>
       </w:pPr>
       <w:r>
-        <w:t>4.3 Extra security and access to areas (FMS.2.c)</w:t>
+        <w:t>Extra-security areas — FMS.2.c</w:t>
       </w:r>
     </w:p>
     <w:p>
       <w:r>
-        <w:t>Why this step matters: A CCTV monitor that is never watched is not extra security -- this step is about areas actually being harder to enter without authorisation, not a camera pointed at an unwatched screen.</w:t>
+        <w:rPr>
+          <w:i/>
+        </w:rPr>
+        <w:t>Boundary with other standards:</w:t>
       </w:r>
     </w:p>
     <w:p>
+      <w:pPr>
+        <w:pStyle w:val="ListParagraph"/>
+      </w:pPr>
       <w:r>
-        <w:t>1. Extra-security areas typically include pharmacy stores, medical-records if held on site, nursery/labour (as COP.8 uses them), server or plant rooms, and the medical-gas manifold (FMS.4) -- plus any other area this hospital has named.</w:t>
+        <w:t>• COP.8.f owns the care process of matching and handing over a neonate and the missing-child response; COP.12.b owns bedside observation of a vulnerable adult -- this step owns the locks, access control and written description, not those care processes.</w:t>
       </w:r>
     </w:p>
     <w:p>
+      <w:pPr>
+        <w:pStyle w:val="ListParagraph"/>
+      </w:pPr>
       <w:r>
-        <w:t>2. «Hospital to define extra-security areas, access by staff, patients and visitors, and the hardware that enforces it» -- locks, access-control hardware, CCTV if installed, and a written access description.</w:t>
-      </w:r>
-    </w:p>
-    <w:p>
-      <w:r>
-        <w:t>3. COP.8.f owns the care process of matching and handing over a neonate and the missing-child response; COP.12.b owns bedside observation of a vulnerable adult -- this step owns the locks, access control and written description, not those care processes.</w:t>
-      </w:r>
-    </w:p>
-    <w:p>
-      <w:r>
-        <w:t>4. A breach that is also an incident is dual-entered in PSQ.5.</w:t>
+        <w:t>• A breach that is also an incident is dual-entered in PSQ.5.</w:t>
       </w:r>
     </w:p>
     <w:p>
@@ -478,32 +871,31 @@
         <w:pStyle w:val="Heading2"/>
       </w:pPr>
       <w:r>
-        <w:t>4.4 Facility inspection rounds at least once a month (FMS.2.d, Core)</w:t>
+        <w:t>Monthly safety walk-through — FMS.2.d (Core)</w:t>
       </w:r>
     </w:p>
     <w:p>
       <w:r>
-        <w:t>Why this step matters: A register signed on the last day of the month from the engineering office, with no ward walk, is the failure this step exists to catch -- the round only counts if clinical and support spaces were actually walked.</w:t>
+        <w:rPr>
+          <w:i/>
+        </w:rPr>
+        <w:t>Boundary with other standards:</w:t>
       </w:r>
     </w:p>
     <w:p>
+      <w:pPr>
+        <w:pStyle w:val="ListParagraph"/>
+      </w:pPr>
       <w:r>
-        <w:t>1. Facility inspection rounds to ensure safety are conducted at least once a month. That interval is set by the objective element itself and is not hospital-optional.</w:t>
+        <w:t>• The monthly interval is set by the objective element itself and is not hospital-optional.</w:t>
       </w:r>
     </w:p>
     <w:p>
+      <w:pPr>
+        <w:pStyle w:val="ListParagraph"/>
+      </w:pPr>
       <w:r>
-        <w:t>2. The round is a walk of occupied clinical and support spaces that can find a blocked exit, a failed grab rail, a wet floor without warning, an unlabelled chemical container, a condemned item still in a corridor (4.6 below), or an open electrical panel (4.5 below); a fire extinguisher missing is handed to FMS.5.</w:t>
-      </w:r>
-    </w:p>
-    <w:p>
-      <w:r>
-        <w:t>3. «Hospital to define who conducts the monthly round, the circuit, and how findings are closed» -- a round that only inspects the director's corridor does not satisfy this step.</w:t>
-      </w:r>
-    </w:p>
-    <w:p>
-      <w:r>
-        <w:t>4. A missed month is treated as a defect, not a gap to be filled retroactively. A finding that is also an incident is dual-entered in PSQ.5; ROM.4.a may use round findings as risk inputs without this step ceasing to be the facility method of record.</w:t>
+        <w:t>• A finding that is also an incident is dual-entered in PSQ.5; ROM.4.a may use round findings as risk inputs without this step ceasing to be the facility method of record.</w:t>
       </w:r>
     </w:p>
     <w:p>
@@ -511,32 +903,39 @@
         <w:pStyle w:val="Heading2"/>
       </w:pPr>
       <w:r>
-        <w:t>4.5 Electrical safety audits of the facility (FMS.2.e)</w:t>
+        <w:t>Electrical safety audit — FMS.2.e</w:t>
       </w:r>
     </w:p>
     <w:p>
       <w:r>
-        <w:t>Why this step matters: A megger reading filed once at commissioning, with no audit since, is not an electrical safety programme -- this step is a recurring audit of the building's electrical installation, not a one-time commissioning record.</w:t>
+        <w:rPr>
+          <w:i/>
+        </w:rPr>
+        <w:t>Boundary with other standards:</w:t>
+      </w:r>
+    </w:p>
+    <w:p>
+      <w:pPr>
+        <w:pStyle w:val="ListParagraph"/>
+      </w:pPr>
+      <w:r>
+        <w:t>• This is not the FMS.1.e loaded DG test and not FMS.3's calibration of a medical device.</w:t>
+      </w:r>
+    </w:p>
+    <w:p>
+      <w:pPr>
+        <w:pStyle w:val="ListParagraph"/>
+      </w:pPr>
+      <w:r>
+        <w:t>• A failed medical device remains FMS.3's concern; a failed building circuit is this audit's concern.</w:t>
       </w:r>
     </w:p>
     <w:p>
       <w:r>
-        <w:t>1. This is not the FMS.1.e loaded DG test and not FMS.3's calibration of a medical device -- it is an audit of the electrical installation as a facility: earthing continuity, residual-current/earth-leakage protection on wet-area and patient-care circuits, overload and discrimination, damaged flexible cords, socket outlets in wet areas, panel labelling and lockability, and isolated-power provision in the OT where this hospital runs one.</w:t>
-      </w:r>
-    </w:p>
-    <w:p>
-      <w:r>
-        <w:t>2. «Hospital to define the electrical safety audit scope, competence of the auditor, interval, and the isolation-until-repaired rule» -- who audits (in-house competent person or licensed contractor), and how a failed earth or a missing ELCB is isolated until it is repaired.</w:t>
-      </w:r>
-    </w:p>
-    <w:p>
-      <w:r>
-        <w:t>3. A failed medical device remains FMS.3's concern; a failed building circuit is this audit's concern.</w:t>
-      </w:r>
-    </w:p>
-    <w:p>
-      <w:r>
-        <w:t xml:space="preserve">Technical source(s) for these steps: </w:t>
+        <w:rPr>
+          <w:i/>
+        </w:rPr>
+        <w:t>Verified source(s):</w:t>
       </w:r>
     </w:p>
     <w:p>
@@ -567,37 +966,39 @@
         <w:pStyle w:val="Heading2"/>
       </w:pPr>
       <w:r>
-        <w:t>4.6 Identification and disposal of material not in use (FMS.2.f, Commitment, ASTERISKED)</w:t>
+        <w:t>Tagging and removing items no longer in use — FMS.2.f (Commitment, ASTERISKED)</w:t>
       </w:r>
     </w:p>
     <w:p>
       <w:r>
-        <w:t>Why this step matters: A condemned ventilator left in a ward bay "until biomedical collects it", with no identification tag, is the failure this step exists to catch. This is the first of the chapter's two documented-evidence anchors -- an assessor will ask how a condemned bed, an obsolete monitor, or construction debris actually leaves the clinical floor.</w:t>
+        <w:rPr>
+          <w:i/>
+        </w:rPr>
+        <w:t>Boundary with other standards:</w:t>
+      </w:r>
+    </w:p>
+    <w:p>
+      <w:pPr>
+        <w:pStyle w:val="ListParagraph"/>
+      </w:pPr>
+      <w:r>
+        <w:t>• Distinct from HIC.3's biomedical-waste stream: HIC.3 owns colour, internal transport, SPCB and common-facility handover. This step is material not in use, not the four-colour clinical waste stream pointed at as the answer.</w:t>
+      </w:r>
+    </w:p>
+    <w:p>
+      <w:pPr>
+        <w:pStyle w:val="ListParagraph"/>
+      </w:pPr>
+      <w:r>
+        <w:t>• Who authorises condemnation includes FMS.3 strike-off when the item is equipment.</w:t>
       </w:r>
     </w:p>
     <w:p>
       <w:r>
-        <w:t>1. There is a procedure which addresses the identification and disposal of material(s) not in use in the organisation -- condemned furniture, obsolete equipment that FMS.3 has struck off the inventory, unused building materials, and expired non-BMW general stores.</w:t>
-      </w:r>
-    </w:p>
-    <w:p>
-      <w:r>
-        <w:t>2. This is distinct from HIC.3's biomedical-waste stream: HIC.3 owns colour, internal transport, SPCB and common-facility handover. This step is material not in use, not the four-colour clinical waste stream pointed at as the answer.</w:t>
-      </w:r>
-    </w:p>
-    <w:p>
-      <w:r>
-        <w:t>3. «Hospital to define the procedure that identifies and disposes of material not in use, including the HIC.3 split» -- how material is identified (tag, location, date, owner), who authorises condemnation including FMS.3 strike-off when the item is equipment, how it is stored so it cannot be reused on a patient, and how it is disposed of or sold.</w:t>
-      </w:r>
-    </w:p>
-    <w:p>
-      <w:r>
-        <w:t>4. A tagged item still sitting in a patient bay is a failure of this OE, not a work-in-progress.</w:t>
-      </w:r>
-    </w:p>
-    <w:p>
-      <w:r>
-        <w:t xml:space="preserve">Technical source(s) for these steps: </w:t>
+        <w:rPr>
+          <w:i/>
+        </w:rPr>
+        <w:t>Verified source(s):</w:t>
       </w:r>
     </w:p>
     <w:p>
@@ -628,37 +1029,39 @@
         <w:pStyle w:val="Heading2"/>
       </w:pPr>
       <w:r>
-        <w:t>4.7 Hazardous materials identified and used safely (FMS.2.g, Core, ASTERISKED)</w:t>
+        <w:t>Hazardous chemicals -- list, label, protect — FMS.2.g (Core, ASTERISKED)</w:t>
       </w:r>
     </w:p>
     <w:p>
       <w:r>
-        <w:t>Why this step matters: A safety data sheet folder in quality, with no label on the actual jerry-can, is not identification. This is the chapter's second documented-evidence anchor -- an assessor will ask for the list, the location, the label, the PPE and the spill method for chemicals this hospital actually holds.</w:t>
+        <w:rPr>
+          <w:i/>
+        </w:rPr>
+        <w:t>Boundary with other standards:</w:t>
+      </w:r>
+    </w:p>
+    <w:p>
+      <w:pPr>
+        <w:pStyle w:val="ListParagraph"/>
+      </w:pPr>
+      <w:r>
+        <w:t>• Not HIC.2's blood/body-fluid spill SOP, not MOM.8's cytotoxic bench spill SOP, not HIC.3's BMW colours, and not AAC.6's laboratory chemical-hygiene programme counted as the whole hospital list -- dual entry applies when a spill meets two definitions.</w:t>
+      </w:r>
+    </w:p>
+    <w:p>
+      <w:pPr>
+        <w:pStyle w:val="ListParagraph"/>
+      </w:pPr>
+      <w:r>
+        <w:t>• NBC 2016 storage provisions apply as the local authority applied them; PESO/explosives rules for gas cylinders remain FMS.4, not this chemical list counted twice.</w:t>
       </w:r>
     </w:p>
     <w:p>
       <w:r>
-        <w:t>1. Hazardous materials are identified and used safely within the organisation -- the facility-wide list: housekeeping chemicals, water-treatment chemicals, diesel and other fuels, mercury if a sphygmomanometer or thermometer stock still exists, engineering solvents, and laboratory bulk stores that sit outside the bench programme.</w:t>
-      </w:r>
-    </w:p>
-    <w:p>
-      <w:r>
-        <w:t>2. This is not HIC.2's blood/body-fluid spill SOP, not MOM.8's cytotoxic bench spill SOP, not HIC.3's BMW colours, and not AAC.6's laboratory chemical-hygiene programme counted as the whole hospital list -- dual entry applies when a spill meets two definitions.</w:t>
-      </w:r>
-    </w:p>
-    <w:p>
-      <w:r>
-        <w:t>3. «Hospital to define the identification and safe use of hazardous materials, including spill method for building chemicals and mercury» -- the inventory of hazardous materials this hospital actually holds (or a recorded absence for a class it does not hold), labelling and segregation, PPE, and who may use which material.</w:t>
-      </w:r>
-    </w:p>
-    <w:p>
-      <w:r>
-        <w:t>4. NBC 2016 storage provisions apply as the local authority applied them; PESO/explosives rules for gas cylinders remain FMS.4, not this chemical list counted twice.</w:t>
-      </w:r>
-    </w:p>
-    <w:p>
-      <w:r>
-        <w:t xml:space="preserve">Technical source(s) for these steps: </w:t>
+        <w:rPr>
+          <w:i/>
+        </w:rPr>
+        <w:t>Verified source(s):</w:t>
       </w:r>
     </w:p>
     <w:p>
@@ -686,87 +1089,10 @@
     </w:p>
     <w:p>
       <w:pPr>
-        <w:pStyle w:val="Heading1"/>
+        <w:pStyle w:val="Heading2"/>
       </w:pPr>
       <w:r>
-        <w:t>5. Records</w:t>
-      </w:r>
-    </w:p>
-    <w:p>
-      <w:r>
-        <w:t>This SOP produces and maintains Records 1-7 (see the FMS.2 Records folder).</w:t>
-      </w:r>
-    </w:p>
-    <w:p>
-      <w:pPr>
-        <w:pStyle w:val="Heading1"/>
-      </w:pPr>
-      <w:r>
-        <w:t>6. Related Documents</w:t>
-      </w:r>
-    </w:p>
-    <w:p>
-      <w:pPr>
-        <w:pStyle w:val="ListParagraph"/>
-      </w:pPr>
-      <w:r>
-        <w:t>Policy — Safety of Patients, Families, Staff and Visitors (FMS.2)</w:t>
-      </w:r>
-    </w:p>
-    <w:p>
-      <w:pPr>
-        <w:pStyle w:val="ListParagraph"/>
-      </w:pPr>
-      <w:r>
-        <w:t>Hospital's Facility Management and Fire Safety Programme (FMS.5)</w:t>
-      </w:r>
-    </w:p>
-    <w:p>
-      <w:pPr>
-        <w:pStyle w:val="ListParagraph"/>
-      </w:pPr>
-      <w:r>
-        <w:t>Hospital's Medical and Support-Service Equipment Programme (FMS.3)</w:t>
-      </w:r>
-    </w:p>
-    <w:p>
-      <w:pPr>
-        <w:pStyle w:val="ListParagraph"/>
-      </w:pPr>
-      <w:r>
-        <w:t>Hospital's Support-Services Infection-Control Policy (HIC.3)</w:t>
-      </w:r>
-    </w:p>
-    <w:p>
-      <w:pPr>
-        <w:pStyle w:val="ListParagraph"/>
-      </w:pPr>
-      <w:r>
-        <w:t>Hospital's Blood/Body-Fluid Spill SOP (HIC.2)</w:t>
-      </w:r>
-    </w:p>
-    <w:p>
-      <w:pPr>
-        <w:pStyle w:val="ListParagraph"/>
-      </w:pPr>
-      <w:r>
-        <w:t>Hospital's Cytotoxic Handling SOP (MOM.8)</w:t>
-      </w:r>
-    </w:p>
-    <w:p>
-      <w:pPr>
-        <w:pStyle w:val="ListParagraph"/>
-      </w:pPr>
-      <w:r>
-        <w:t>Hospital's Laboratory Safety Programme (AAC.6)</w:t>
-      </w:r>
-    </w:p>
-    <w:p>
-      <w:pPr>
-        <w:pStyle w:val="Heading1"/>
-      </w:pPr>
-      <w:r>
-        <w:t>7. Where This SOP's Requirements Come From (Verified Sources)</w:t>
+        <w:t>Full reference list</w:t>
       </w:r>
     </w:p>
     <w:p>
@@ -928,19 +1254,6 @@
       </w:hyperlink>
       <w:r>
         <w:t>. Health Facilities Management. Framework reference only.</w:t>
-      </w:r>
-    </w:p>
-    <w:p>
-      <w:pPr>
-        <w:pStyle w:val="Heading1"/>
-      </w:pPr>
-      <w:r>
-        <w:t>8. Review</w:t>
-      </w:r>
-    </w:p>
-    <w:p>
-      <w:r>
-        <w:t>This policy is reviewed at «Hospital to define the review interval for this policy», and sooner when a monthly round was missed, or when FMS.1, FMS.3, FMS.4, FMS.5, HIC.2, HIC.3, AAC.6, COP.8 or COP.12 that this document hands work to are revised.</w:t>
       </w:r>
     </w:p>
     <w:sectPr>

</xml_diff>